<commit_message>
Make АНО «Содействие» the initiator and applicant in grant documents
Co-Authored-By: Claude Opus 5.5 <noreply@anthropic.com>
Claude-Session: https://claude.ai/code/session_01DZfKE2Qbh1BJBTBdA16C3f
</commit_message>
<xml_diff>
--- a/grant/Grant_Pomoshch-doma-3D_ryba.docx
+++ b/grant/Grant_Pomoshch-doma-3D_ryba.docx
@@ -33,7 +33,7 @@
         <w:t xml:space="preserve"> </w:t>
       </w:r>
       <w:r>
-        <w:t xml:space="preserve">В [квадратных скобках] — то, что нужно вписать или уточнить. Суммы в бюджете ориентировочные, их нужно сверить с реальными ценами. Структура повторяет типовую заявку на социальный грант (паспорт, проблема, цели, план, результаты, бюджет, партнёры, тиражирование). Под требования конкретного фонда её адаптирует НКО-заявитель.</w:t>
+        <w:t xml:space="preserve">В [квадратных скобках] — то, что нужно вписать или уточнить. Суммы в бюджете ориентировочные, их нужно сверить с реальными ценами. Инициатор и заявитель — АНО «Содействие», ИТ-академия ИТ-парка — партнёр. Структура повторяет типовую заявку на социальный грант (паспорт, проблема, цели, план, результаты, бюджет, партнёры, тиражирование). Под требования конкретного фонда её адаптирует АНО «Содействие».</w:t>
       </w:r>
     </w:p>
     <w:bookmarkStart w:id="9" w:name="паспорт-проекта"/>
@@ -146,21 +146,21 @@
                 <w:bCs/>
                 <w:sz w:val="19"/>
               </w:rPr>
-              <w:t xml:space="preserve">Заявитель</w:t>
-            </w:r>
-          </w:p>
-        </w:tc>
-        <w:tc>
-          <w:tcPr/>
-          <w:p>
-            <w:pPr>
-              <w:pStyle w:val="Compact"/>
-            </w:pPr>
-            <w:r>
-              <w:rPr>
-                <w:sz w:val="19"/>
-              </w:rPr>
-              <w:t xml:space="preserve">[Название НКО], [город]</w:t>
+              <w:t xml:space="preserve">Инициатор и заявитель</w:t>
+            </w:r>
+          </w:p>
+        </w:tc>
+        <w:tc>
+          <w:tcPr/>
+          <w:p>
+            <w:pPr>
+              <w:pStyle w:val="Compact"/>
+            </w:pPr>
+            <w:r>
+              <w:rPr>
+                <w:sz w:val="19"/>
+              </w:rPr>
+              <w:t xml:space="preserve">АНО «Содействие», [город]. Автор идеи, организатор опроса подопечных, руководитель проекта и получатель гранта</w:t>
             </w:r>
           </w:p>
         </w:tc>
@@ -483,7 +483,7 @@
         <w:t xml:space="preserve"> </w:t>
       </w:r>
       <w:r>
-        <w:t xml:space="preserve">Проведён опрос 200 подопечных [кем: НКО / соцслужбой; когда: ___]. Выявлены 10 самых частых сложностей:</w:t>
+        <w:t xml:space="preserve">Проведён опрос 200 подопечных силами АНО «Содействие» [когда: ___]. Выявлены 10 самых частых сложностей:</w:t>
       </w:r>
     </w:p>
     <w:tbl>
@@ -1355,7 +1355,7 @@
         <w:t xml:space="preserve"> </w:t>
       </w:r>
       <w:r>
-        <w:t xml:space="preserve">У ИТ-академии есть педагоги по 3D-моделированию и робототехнике, опыт проектной работы с детьми (800+ учащихся в год, воркшоп «НейроStart»: 680 студентов, 30+ приложений) и площадка ИТ-парка. У НКО [название] — доступ к подопечным, опыт работы с ними и опыт реализации социальных проектов.</w:t>
+        <w:t xml:space="preserve">АНО «Содействие» — инициатор проекта. Она работает с подопечными, которым нужен постоянный уход, провела опрос 200 человек и знает их нужды изнутри [дополнить: сколько лет работает, сколько подопечных, реализованные проекты]. Технологического партнёра — ИТ-академию ИТ-парка — АНО привлекла потому, что у Академии есть педагоги по 3D-моделированию и робототехнике, опыт проектной работы с детьми (800+ учащихся в год, воркшоп «НейроStart»: 680 студентов, 30+ приложений) и площадка ИТ-парка.</w:t>
       </w:r>
     </w:p>
     <w:bookmarkEnd w:id="10"/>
@@ -1822,7 +1822,7 @@
               <w:rPr>
                 <w:sz w:val="19"/>
               </w:rPr>
-              <w:t xml:space="preserve">НКО</w:t>
+              <w:t xml:space="preserve">АНО «Содействие»</w:t>
             </w:r>
           </w:p>
         </w:tc>
@@ -1954,7 +1954,7 @@
               <w:rPr>
                 <w:sz w:val="19"/>
               </w:rPr>
-              <w:t xml:space="preserve">НКО + Академия</w:t>
+              <w:t xml:space="preserve">АНО «Содействие» + Академия</w:t>
             </w:r>
           </w:p>
         </w:tc>
@@ -2042,7 +2042,7 @@
               <w:rPr>
                 <w:sz w:val="19"/>
               </w:rPr>
-              <w:t xml:space="preserve">НКО + Академия</w:t>
+              <w:t xml:space="preserve">АНО «Содействие» + Академия</w:t>
             </w:r>
           </w:p>
         </w:tc>
@@ -2130,7 +2130,7 @@
               <w:rPr>
                 <w:sz w:val="19"/>
               </w:rPr>
-              <w:t xml:space="preserve">НКО + дети</w:t>
+              <w:t xml:space="preserve">АНО «Содействие» + дети</w:t>
             </w:r>
           </w:p>
         </w:tc>
@@ -2174,7 +2174,7 @@
               <w:rPr>
                 <w:sz w:val="19"/>
               </w:rPr>
-              <w:t xml:space="preserve">Академия + НКО</w:t>
+              <w:t xml:space="preserve">Академия + АНО «Содействие»</w:t>
             </w:r>
           </w:p>
         </w:tc>
@@ -2218,7 +2218,7 @@
               <w:rPr>
                 <w:sz w:val="19"/>
               </w:rPr>
-              <w:t xml:space="preserve">ИТ-парк + НКО</w:t>
+              <w:t xml:space="preserve">АНО «Содействие» + ИТ-парк</w:t>
             </w:r>
           </w:p>
         </w:tc>
@@ -2415,7 +2415,7 @@
         <w:t xml:space="preserve"> </w:t>
       </w:r>
       <w:r>
-        <w:t xml:space="preserve">НКО, соцслужбы и школы узнают о возможностях Академии.</w:t>
+        <w:t xml:space="preserve">АНО «Содействие», другие НКО, соцслужбы и школы узнают о возможностях Академии.</w:t>
       </w:r>
     </w:p>
     <w:p>
@@ -4327,21 +4327,21 @@
               <w:rPr>
                 <w:sz w:val="19"/>
               </w:rPr>
-              <w:t xml:space="preserve">НКО [название]</w:t>
-            </w:r>
-          </w:p>
-        </w:tc>
-        <w:tc>
-          <w:tcPr/>
-          <w:p>
-            <w:pPr>
-              <w:pStyle w:val="Compact"/>
-            </w:pPr>
-            <w:r>
-              <w:rPr>
-                <w:sz w:val="19"/>
-              </w:rPr>
-              <w:t xml:space="preserve">Опрос 200 подопечных, координация выездов, сопровождение</w:t>
+              <w:t xml:space="preserve">АНО «Содействие»</w:t>
+            </w:r>
+          </w:p>
+        </w:tc>
+        <w:tc>
+          <w:tcPr/>
+          <w:p>
+            <w:pPr>
+              <w:pStyle w:val="Compact"/>
+            </w:pPr>
+            <w:r>
+              <w:rPr>
+                <w:sz w:val="19"/>
+              </w:rPr>
+              <w:t xml:space="preserve">Опрос 200 подопечных, координация выездов и работы с подопечными, сопровождение, управление проектом</w:t>
             </w:r>
           </w:p>
         </w:tc>
@@ -4720,7 +4720,7 @@
               <w:rPr>
                 <w:sz w:val="19"/>
               </w:rPr>
-              <w:t xml:space="preserve">Соцсети НКО</w:t>
+              <w:t xml:space="preserve">Соцсети АНО «Содействие»</w:t>
             </w:r>
           </w:p>
         </w:tc>
@@ -4977,7 +4977,7 @@
               <w:rPr>
                 <w:sz w:val="19"/>
               </w:rPr>
-              <w:t xml:space="preserve">Встречи короткие, в присутствии сотрудника НКО / родственника; график согласуется заранее</w:t>
+              <w:t xml:space="preserve">Встречи короткие, в присутствии сотрудника АНО «Содействие» / родственника; график согласуется заранее</w:t>
             </w:r>
           </w:p>
         </w:tc>
@@ -5196,7 +5196,7 @@
               <w:rPr>
                 <w:sz w:val="19"/>
               </w:rPr>
-              <w:t xml:space="preserve">Руководитель проекта (от НКО)</w:t>
+              <w:t xml:space="preserve">Руководитель проекта (от АНО «Содействие»)</w:t>
             </w:r>
           </w:p>
         </w:tc>
@@ -5473,13 +5473,13 @@
           <w:b/>
           <w:bCs/>
         </w:rPr>
-        <w:t xml:space="preserve">НКО-заявитель:</w:t>
-      </w:r>
-      <w:r>
-        <w:t xml:space="preserve"> </w:t>
-      </w:r>
-      <w:r>
-        <w:t xml:space="preserve">название, ОГРН, опыт, кто руководитель проекта.</w:t>
+        <w:t xml:space="preserve">АНО «Содействие»:</w:t>
+      </w:r>
+      <w:r>
+        <w:t xml:space="preserve"> </w:t>
+      </w:r>
+      <w:r>
+        <w:t xml:space="preserve">полное наименование, ОГРН, год регистрации, опыт и реализованные проекты, кто руководитель проекта.</w:t>
       </w:r>
     </w:p>
     <w:p>

</xml_diff>